<commit_message>
Restore full character bible in visual style profile v2
Co-Authored-By: Claude Opus 5.5 <noreply@anthropic.com>
Claude-Session: https://claude.ai/code/session_01YJE41d5btXjxgncsbRHMm3
</commit_message>
<xml_diff>
--- a/fableon/the-tide-mother/FABLEON-The-Tide-Mother-Production-Pack-v2.docx
+++ b/fableon/the-tide-mother/FABLEON-The-Tide-Mother-Production-Pack-v2.docx
@@ -6656,125 +6656,7 @@
         <w:pStyle w:val="Heading2"/>
       </w:pPr>
       <w:r>
-        <w:t xml:space="preserve">7. Characters (silhouettes made distinct with color)</w:t>
-      </w:r>
-    </w:p>
-    <w:p>
-      <w:pPr>
-        <w:pStyle w:val="ListParagraph"/>
-        <w:numPr>
-          <w:ilvl w:val="0"/>
-          <w:numId w:val="2"/>
-        </w:numPr>
-        <w:spacing w:after="40"/>
-      </w:pPr>
-      <w:r>
-        <w:t xml:space="preserve">Maren: indigo dress and moss-green shawl.</w:t>
-      </w:r>
-    </w:p>
-    <w:p>
-      <w:pPr>
-        <w:pStyle w:val="ListParagraph"/>
-        <w:numPr>
-          <w:ilvl w:val="0"/>
-          <w:numId w:val="2"/>
-        </w:numPr>
-        <w:spacing w:after="40"/>
-      </w:pPr>
-      <w:r>
-        <w:t xml:space="preserve">Odile: </w:t>
-      </w:r>
-      <w:r>
-        <w:rPr>
-          <w:b/>
-          <w:bCs/>
-        </w:rPr>
-        <w:t xml:space="preserve">saffron</w:t>
-      </w:r>
-      <w:r>
-        <w:t xml:space="preserve"> headscarf.</w:t>
-      </w:r>
-    </w:p>
-    <w:p>
-      <w:pPr>
-        <w:pStyle w:val="ListParagraph"/>
-        <w:numPr>
-          <w:ilvl w:val="0"/>
-          <w:numId w:val="2"/>
-        </w:numPr>
-        <w:spacing w:after="40"/>
-      </w:pPr>
-      <w:r>
-        <w:t xml:space="preserve">Bram: </w:t>
-      </w:r>
-      <w:r>
-        <w:rPr>
-          <w:b/>
-          <w:bCs/>
-        </w:rPr>
-        <w:t xml:space="preserve">red</w:t>
-      </w:r>
-      <w:r>
-        <w:t xml:space="preserve"> knitted cap and fishbone toothpick.</w:t>
-      </w:r>
-    </w:p>
-    <w:p>
-      <w:pPr>
-        <w:pStyle w:val="ListParagraph"/>
-        <w:numPr>
-          <w:ilvl w:val="0"/>
-          <w:numId w:val="2"/>
-        </w:numPr>
-        <w:spacing w:after="40"/>
-      </w:pPr>
-      <w:r>
-        <w:t xml:space="preserve">Hesk: grey cloak with </w:t>
-      </w:r>
-      <w:r>
-        <w:rPr>
-          <w:b/>
-          <w:bCs/>
-        </w:rPr>
-        <w:t xml:space="preserve">teal sea-glass beads</w:t>
-      </w:r>
-      <w:r>
-        <w:t xml:space="preserve"> in his beard.</w:t>
-      </w:r>
-    </w:p>
-    <w:p>
-      <w:pPr>
-        <w:pStyle w:val="ListParagraph"/>
-        <w:numPr>
-          <w:ilvl w:val="0"/>
-          <w:numId w:val="2"/>
-        </w:numPr>
-        <w:spacing w:after="40"/>
-      </w:pPr>
-      <w:r>
-        <w:t xml:space="preserve">Jory: </w:t>
-      </w:r>
-      <w:r>
-        <w:rPr>
-          <w:b/>
-          <w:bCs/>
-        </w:rPr>
-        <w:t xml:space="preserve">green</w:t>
-      </w:r>
-      <w:r>
-        <w:t xml:space="preserve"> cap.</w:t>
-      </w:r>
-    </w:p>
-    <w:p>
-      <w:pPr>
-        <w:pStyle w:val="ListParagraph"/>
-        <w:numPr>
-          <w:ilvl w:val="0"/>
-          <w:numId w:val="2"/>
-        </w:numPr>
-        <w:spacing w:after="40"/>
-      </w:pPr>
-      <w:r>
-        <w:t xml:space="preserve">Tal: pearl, teal and cyan.</w:t>
+        <w:t xml:space="preserve">7. Character bible (keep identical in every prompt)</w:t>
       </w:r>
     </w:p>
     <w:p>
@@ -6782,7 +6664,378 @@
         <w:spacing w:after="120"/>
       </w:pPr>
       <w:r>
-        <w:t xml:space="preserve">Full voices and behaviors are in </w:t>
+        <w:t xml:space="preserve">These are the exact descriptions used in all 120 image prompts. Paste them unchanged so faces and costumes stay consistent.</w:t>
+      </w:r>
+    </w:p>
+    <w:p>
+      <w:pPr>
+        <w:pStyle w:val="ListParagraph"/>
+        <w:numPr>
+          <w:ilvl w:val="0"/>
+          <w:numId w:val="2"/>
+        </w:numPr>
+        <w:spacing w:after="40"/>
+      </w:pPr>
+      <w:r>
+        <w:rPr>
+          <w:b/>
+          <w:bCs/>
+        </w:rPr>
+        <w:t xml:space="preserve">MAREN:</w:t>
+      </w:r>
+      <w:r>
+        <w:t xml:space="preserve"> a woman about 30, long wet tangled dark-brown hair with a single thin braid on the left, pale weathered freckled skin, tired grey-green eyes, faded indigo wool dress, moss-green knitted shawl, rope belt with a net-mending needle.</w:t>
+      </w:r>
+    </w:p>
+    <w:p>
+      <w:pPr>
+        <w:pStyle w:val="ListParagraph"/>
+        <w:numPr>
+          <w:ilvl w:val="0"/>
+          <w:numId w:val="2"/>
+        </w:numPr>
+        <w:spacing w:after="40"/>
+      </w:pPr>
+      <w:r>
+        <w:rPr>
+          <w:b/>
+          <w:bCs/>
+        </w:rPr>
+        <w:t xml:space="preserve">MAREN (pregnant, prologue and Act I opening only):</w:t>
+      </w:r>
+      <w:r>
+        <w:t xml:space="preserve"> the same description, heavily pregnant.</w:t>
+      </w:r>
+    </w:p>
+    <w:p>
+      <w:pPr>
+        <w:pStyle w:val="ListParagraph"/>
+        <w:numPr>
+          <w:ilvl w:val="0"/>
+          <w:numId w:val="2"/>
+        </w:numPr>
+        <w:spacing w:after="40"/>
+      </w:pPr>
+      <w:r>
+        <w:rPr>
+          <w:b/>
+          <w:bCs/>
+        </w:rPr>
+        <w:t xml:space="preserve">TAL as a baby (cat-sized):</w:t>
+      </w:r>
+      <w:r>
+        <w:t xml:space="preserve"> amphibian-dragon newborn, translucent pearl-grey skin with a wet sheen, oversized glassy dark-blue eyes, tiny fin-like wings, a soft frilled crest, webbed claws.</w:t>
+      </w:r>
+    </w:p>
+    <w:p>
+      <w:pPr>
+        <w:pStyle w:val="ListParagraph"/>
+        <w:numPr>
+          <w:ilvl w:val="0"/>
+          <w:numId w:val="2"/>
+        </w:numPr>
+        <w:spacing w:after="40"/>
+      </w:pPr>
+      <w:r>
+        <w:rPr>
+          <w:b/>
+          <w:bCs/>
+        </w:rPr>
+        <w:t xml:space="preserve">TAL as a juvenile (pony-sized):</w:t>
+      </w:r>
+      <w:r>
+        <w:t xml:space="preserve"> pearl-grey scales with an abalone-teal shimmer, long fin-like wings, frills along the spine, a faint electric-blue glow in the throat.</w:t>
+      </w:r>
+    </w:p>
+    <w:p>
+      <w:pPr>
+        <w:pStyle w:val="ListParagraph"/>
+        <w:numPr>
+          <w:ilvl w:val="0"/>
+          <w:numId w:val="2"/>
+        </w:numPr>
+        <w:spacing w:after="40"/>
+      </w:pPr>
+      <w:r>
+        <w:rPr>
+          <w:b/>
+          <w:bCs/>
+        </w:rPr>
+        <w:t xml:space="preserve">TAL as an adult (fishing-boat-sized):</w:t>
+      </w:r>
+      <w:r>
+        <w:t xml:space="preserve"> iridescent pearl and teal scales, deep sea-blue manta-fin wings, a crown of frilled spines, luminous cyan slit-pupil eyes, blue-white fire with bioluminescent blue veins.</w:t>
+      </w:r>
+    </w:p>
+    <w:p>
+      <w:pPr>
+        <w:pStyle w:val="ListParagraph"/>
+        <w:numPr>
+          <w:ilvl w:val="0"/>
+          <w:numId w:val="2"/>
+        </w:numPr>
+        <w:spacing w:after="40"/>
+      </w:pPr>
+      <w:r>
+        <w:rPr>
+          <w:b/>
+          <w:bCs/>
+        </w:rPr>
+        <w:t xml:space="preserve">ODILE:</w:t>
+      </w:r>
+      <w:r>
+        <w:t xml:space="preserve"> a plump woman about 45, grey-streaked auburn hair under a </w:t>
+      </w:r>
+      <w:r>
+        <w:rPr>
+          <w:b/>
+          <w:bCs/>
+        </w:rPr>
+        <w:t xml:space="preserve">saffron-yellow headscarf</w:t>
+      </w:r>
+      <w:r>
+        <w:t xml:space="preserve">, ruddy cheeks, oatmeal apron over a </w:t>
+      </w:r>
+      <w:r>
+        <w:rPr>
+          <w:b/>
+          <w:bCs/>
+        </w:rPr>
+        <w:t xml:space="preserve">rust-brown</w:t>
+      </w:r>
+      <w:r>
+        <w:t xml:space="preserve"> wool dress.</w:t>
+      </w:r>
+    </w:p>
+    <w:p>
+      <w:pPr>
+        <w:pStyle w:val="ListParagraph"/>
+        <w:numPr>
+          <w:ilvl w:val="0"/>
+          <w:numId w:val="2"/>
+        </w:numPr>
+        <w:spacing w:after="40"/>
+      </w:pPr>
+      <w:r>
+        <w:rPr>
+          <w:b/>
+          <w:bCs/>
+        </w:rPr>
+        <w:t xml:space="preserve">BRAM:</w:t>
+      </w:r>
+      <w:r>
+        <w:t xml:space="preserve"> a burly man about 40, scarred jaw, matted red-brown beard, </w:t>
+      </w:r>
+      <w:r>
+        <w:rPr>
+          <w:b/>
+          <w:bCs/>
+        </w:rPr>
+        <w:t xml:space="preserve">red knitted fisherman's cap</w:t>
+      </w:r>
+      <w:r>
+        <w:t xml:space="preserve">, oiled leather fisherman's smock, sealskin vest, </w:t>
+      </w:r>
+      <w:r>
+        <w:rPr>
+          <w:b/>
+          <w:bCs/>
+        </w:rPr>
+        <w:t xml:space="preserve">a fishbone toothpick between his teeth</w:t>
+      </w:r>
+      <w:r>
+        <w:t xml:space="preserve">.</w:t>
+      </w:r>
+    </w:p>
+    <w:p>
+      <w:pPr>
+        <w:pStyle w:val="ListParagraph"/>
+        <w:numPr>
+          <w:ilvl w:val="0"/>
+          <w:numId w:val="2"/>
+        </w:numPr>
+        <w:spacing w:after="40"/>
+      </w:pPr>
+      <w:r>
+        <w:rPr>
+          <w:b/>
+          <w:bCs/>
+        </w:rPr>
+        <w:t xml:space="preserve">HESK:</w:t>
+      </w:r>
+      <w:r>
+        <w:t xml:space="preserve"> about 70, long white beard </w:t>
+      </w:r>
+      <w:r>
+        <w:rPr>
+          <w:b/>
+          <w:bCs/>
+        </w:rPr>
+        <w:t xml:space="preserve">braided with tiny teal sea-glass beads</w:t>
+      </w:r>
+      <w:r>
+        <w:t xml:space="preserve">, heavy grey hooded cloak, wooden staff carved with wave patterns.</w:t>
+      </w:r>
+    </w:p>
+    <w:p>
+      <w:pPr>
+        <w:pStyle w:val="ListParagraph"/>
+        <w:numPr>
+          <w:ilvl w:val="0"/>
+          <w:numId w:val="2"/>
+        </w:numPr>
+        <w:spacing w:after="40"/>
+      </w:pPr>
+      <w:r>
+        <w:rPr>
+          <w:b/>
+          <w:bCs/>
+        </w:rPr>
+        <w:t xml:space="preserve">JORY (new in v2):</w:t>
+      </w:r>
+      <w:r>
+        <w:t xml:space="preserve"> a lanky young fisherman about 18, messy blond hair under a </w:t>
+      </w:r>
+      <w:r>
+        <w:rPr>
+          <w:b/>
+          <w:bCs/>
+        </w:rPr>
+        <w:t xml:space="preserve">green wool cap</w:t>
+      </w:r>
+      <w:r>
+        <w:t xml:space="preserve">. He speaks the VILLAGER lines.</w:t>
+      </w:r>
+    </w:p>
+    <w:p>
+      <w:pPr>
+        <w:pStyle w:val="ListParagraph"/>
+        <w:numPr>
+          <w:ilvl w:val="0"/>
+          <w:numId w:val="2"/>
+        </w:numPr>
+        <w:spacing w:after="40"/>
+      </w:pPr>
+      <w:r>
+        <w:rPr>
+          <w:b/>
+          <w:bCs/>
+        </w:rPr>
+        <w:t xml:space="preserve">VILLAGERS:</w:t>
+      </w:r>
+      <w:r>
+        <w:t xml:space="preserve"> layered undyed wool and oilskins with </w:t>
+      </w:r>
+      <w:r>
+        <w:rPr>
+          <w:b/>
+          <w:bCs/>
+        </w:rPr>
+        <w:t xml:space="preserve">colorful dyed scarves</w:t>
+      </w:r>
+      <w:r>
+        <w:t xml:space="preserve">; torches, gaffs and harpoons.</w:t>
+      </w:r>
+    </w:p>
+    <w:p>
+      <w:pPr>
+        <w:spacing w:after="120"/>
+      </w:pPr>
+      <w:r>
+        <w:rPr>
+          <w:b/>
+          <w:bCs/>
+        </w:rPr>
+        <w:t xml:space="preserve">Changes from v1 (bold above):</w:t>
+      </w:r>
+      <w:r>
+        <w:t xml:space="preserve"> Odile's headscarf went from linen to saffron. Bram gained a red cap and a fishbone toothpick. Hesk's beard gained teal sea-glass beads. Jory was added, and the villagers got dyed scarves. Each main character now has a signature color, so viewers can tell them apart at a glance:</w:t>
+      </w:r>
+    </w:p>
+    <w:p>
+      <w:pPr>
+        <w:pStyle w:val="ListParagraph"/>
+        <w:numPr>
+          <w:ilvl w:val="0"/>
+          <w:numId w:val="2"/>
+        </w:numPr>
+        <w:spacing w:after="40"/>
+      </w:pPr>
+      <w:r>
+        <w:t xml:space="preserve">Maren: indigo and moss green</w:t>
+      </w:r>
+    </w:p>
+    <w:p>
+      <w:pPr>
+        <w:pStyle w:val="ListParagraph"/>
+        <w:numPr>
+          <w:ilvl w:val="0"/>
+          <w:numId w:val="2"/>
+        </w:numPr>
+        <w:spacing w:after="40"/>
+      </w:pPr>
+      <w:r>
+        <w:t xml:space="preserve">Odile: saffron</w:t>
+      </w:r>
+    </w:p>
+    <w:p>
+      <w:pPr>
+        <w:pStyle w:val="ListParagraph"/>
+        <w:numPr>
+          <w:ilvl w:val="0"/>
+          <w:numId w:val="2"/>
+        </w:numPr>
+        <w:spacing w:after="40"/>
+      </w:pPr>
+      <w:r>
+        <w:t xml:space="preserve">Bram: red</w:t>
+      </w:r>
+    </w:p>
+    <w:p>
+      <w:pPr>
+        <w:pStyle w:val="ListParagraph"/>
+        <w:numPr>
+          <w:ilvl w:val="0"/>
+          <w:numId w:val="2"/>
+        </w:numPr>
+        <w:spacing w:after="40"/>
+      </w:pPr>
+      <w:r>
+        <w:t xml:space="preserve">Hesk: grey and teal</w:t>
+      </w:r>
+    </w:p>
+    <w:p>
+      <w:pPr>
+        <w:pStyle w:val="ListParagraph"/>
+        <w:numPr>
+          <w:ilvl w:val="0"/>
+          <w:numId w:val="2"/>
+        </w:numPr>
+        <w:spacing w:after="40"/>
+      </w:pPr>
+      <w:r>
+        <w:t xml:space="preserve">Jory: green</w:t>
+      </w:r>
+    </w:p>
+    <w:p>
+      <w:pPr>
+        <w:pStyle w:val="ListParagraph"/>
+        <w:numPr>
+          <w:ilvl w:val="0"/>
+          <w:numId w:val="2"/>
+        </w:numPr>
+        <w:spacing w:after="40"/>
+      </w:pPr>
+      <w:r>
+        <w:t xml:space="preserve">Tal: pearl, teal and cyan</w:t>
+      </w:r>
+    </w:p>
+    <w:p>
+      <w:pPr>
+        <w:spacing w:after="120"/>
+      </w:pPr>
+      <w:r>
+        <w:t xml:space="preserve">Voices and behaviors for every character are in </w:t>
       </w:r>
       <w:r>
         <w:rPr>

</xml_diff>